<commit_message>
fix: sharedrive id CURD
</commit_message>
<xml_diff>
--- a/app/templates/hkd/001_GIAY GIOI THIEU.docx
+++ b/app/templates/hkd/001_GIAY GIOI THIEU.docx
@@ -876,7 +876,24 @@
           <w:szCs w:val="26"/>
           <w:lang w:val="vi-VN"/>
         </w:rPr>
-        <w:t xml:space="preserve">để nộp hồ sơ đăng ký thành lập </w:t>
+        <w:t>để n</w:t>
+      </w:r>
+      <w:r>
+        <w:rPr>
+          <w:rFonts w:ascii="Times New Roman" w:eastAsia="Times New Roman" w:hAnsi="Times New Roman"/>
+          <w:sz w:val="26"/>
+          <w:szCs w:val="26"/>
+        </w:rPr>
+        <w:t>hận</w:t>
+      </w:r>
+      <w:r>
+        <w:rPr>
+          <w:rFonts w:ascii="Times New Roman" w:eastAsia="Times New Roman" w:hAnsi="Times New Roman"/>
+          <w:sz w:val="26"/>
+          <w:szCs w:val="26"/>
+          <w:lang w:val="vi-VN"/>
+        </w:rPr>
+        <w:t xml:space="preserve"> hồ sơ đăng ký thành lập </w:t>
       </w:r>
       <w:r>
         <w:rPr>

</xml_diff>

<commit_message>
update: Paste CCCD, fix: template hkd
</commit_message>
<xml_diff>
--- a/app/templates/hkd/001_GIAY GIOI THIEU.docx
+++ b/app/templates/hkd/001_GIAY GIOI THIEU.docx
@@ -411,40 +411,24 @@
           <w:szCs w:val="26"/>
           <w:lang w:val="vi-VN"/>
         </w:rPr>
-        <w:t>Kính gửi: Phòng Kinh tế</w:t>
-      </w:r>
-      <w:r>
-        <w:rPr>
-          <w:rFonts w:ascii="Times New Roman" w:eastAsia="Times New Roman" w:hAnsi="Times New Roman" w:cs="Times New Roman"/>
-          <w:sz w:val="26"/>
-          <w:szCs w:val="26"/>
-        </w:rPr>
-        <w:t>{{</w:t>
-      </w:r>
-      <w:r>
-        <w:rPr>
-          <w:rFonts w:ascii="Times New Roman" w:eastAsia="Times New Roman" w:hAnsi="Times New Roman" w:cs="Times New Roman"/>
-          <w:sz w:val="26"/>
-          <w:szCs w:val="26"/>
-        </w:rPr>
-        <w:t>suffix</w:t>
-      </w:r>
-      <w:r>
-        <w:rPr>
-          <w:rFonts w:ascii="Times New Roman" w:eastAsia="Times New Roman" w:hAnsi="Times New Roman" w:cs="Times New Roman"/>
-          <w:sz w:val="26"/>
-          <w:szCs w:val="26"/>
-        </w:rPr>
-        <w:t>}}</w:t>
-      </w:r>
-      <w:r>
-        <w:rPr>
-          <w:rFonts w:ascii="Times New Roman" w:eastAsia="Times New Roman" w:hAnsi="Times New Roman" w:cs="Times New Roman"/>
-          <w:sz w:val="26"/>
-          <w:szCs w:val="26"/>
-          <w:lang w:val="vi-VN"/>
-        </w:rPr>
-        <w:t xml:space="preserve"> - UBND </w:t>
+        <w:t xml:space="preserve">Kính gửi: </w:t>
+      </w:r>
+      <w:r>
+        <w:rPr>
+          <w:rFonts w:ascii="Times New Roman" w:eastAsia="Times New Roman" w:hAnsi="Times New Roman" w:cs="Times New Roman"/>
+          <w:sz w:val="26"/>
+          <w:szCs w:val="26"/>
+        </w:rPr>
+        <w:t>Điểm phục vụ hành chính công</w:t>
+      </w:r>
+      <w:r>
+        <w:rPr>
+          <w:rFonts w:ascii="Times New Roman" w:eastAsia="Times New Roman" w:hAnsi="Times New Roman" w:cs="Times New Roman"/>
+          <w:sz w:val="26"/>
+          <w:szCs w:val="26"/>
+          <w:lang w:val="vi-VN"/>
+        </w:rPr>
+        <w:t xml:space="preserve"> </w:t>
       </w:r>
       <w:r>
         <w:rPr>
@@ -807,65 +791,56 @@
           <w:rFonts w:ascii="Times New Roman" w:eastAsia="Times New Roman" w:hAnsi="Times New Roman"/>
           <w:sz w:val="26"/>
           <w:szCs w:val="26"/>
-          <w:lang w:val="vi-VN"/>
-        </w:rPr>
-        <w:t>Phòng Kinh tế</w:t>
-      </w:r>
-      <w:r>
-        <w:rPr>
-          <w:rFonts w:ascii="Times New Roman" w:eastAsia="Times New Roman" w:hAnsi="Times New Roman" w:cs="Times New Roman"/>
-          <w:sz w:val="26"/>
-          <w:szCs w:val="26"/>
-        </w:rPr>
-        <w:t>{{</w:t>
-      </w:r>
-      <w:r>
-        <w:rPr>
-          <w:rFonts w:ascii="Times New Roman" w:eastAsia="Times New Roman" w:hAnsi="Times New Roman" w:cs="Times New Roman"/>
-          <w:sz w:val="26"/>
-          <w:szCs w:val="26"/>
-        </w:rPr>
-        <w:t>suffix</w:t>
-      </w:r>
-      <w:r>
-        <w:rPr>
-          <w:rFonts w:ascii="Times New Roman" w:eastAsia="Times New Roman" w:hAnsi="Times New Roman" w:cs="Times New Roman"/>
-          <w:sz w:val="26"/>
-          <w:szCs w:val="26"/>
-        </w:rPr>
-        <w:t>}}</w:t>
-      </w:r>
-      <w:r>
-        <w:rPr>
-          <w:rFonts w:ascii="Times New Roman" w:eastAsia="Times New Roman" w:hAnsi="Times New Roman" w:cs="Times New Roman"/>
-          <w:sz w:val="26"/>
-          <w:szCs w:val="26"/>
-          <w:lang w:val="vi-VN"/>
+        </w:rPr>
+        <w:t>Điểm phục vụ hành chính công</w:t>
+      </w:r>
+      <w:r>
+        <w:rPr>
+          <w:rFonts w:ascii="Times New Roman" w:eastAsia="Times New Roman" w:hAnsi="Times New Roman"/>
+          <w:sz w:val="26"/>
+          <w:szCs w:val="26"/>
         </w:rPr>
         <w:t xml:space="preserve"> </w:t>
       </w:r>
       <w:r>
         <w:rPr>
+          <w:rFonts w:ascii="Times New Roman" w:eastAsia="Times New Roman" w:hAnsi="Times New Roman" w:cs="Times New Roman"/>
+          <w:sz w:val="26"/>
+          <w:szCs w:val="26"/>
+        </w:rPr>
+        <w:t>{{hkd_ward}}</w:t>
+      </w:r>
+      <w:r>
+        <w:rPr>
+          <w:rFonts w:ascii="Times New Roman" w:eastAsia="Times New Roman" w:hAnsi="Times New Roman" w:cs="Times New Roman"/>
+          <w:sz w:val="26"/>
+          <w:szCs w:val="26"/>
+        </w:rPr>
+        <w:t xml:space="preserve"> </w:t>
+      </w:r>
+      <w:r>
+        <w:rPr>
           <w:rFonts w:ascii="Times New Roman" w:eastAsia="Times New Roman" w:hAnsi="Times New Roman"/>
           <w:sz w:val="26"/>
           <w:szCs w:val="26"/>
           <w:lang w:val="vi-VN"/>
         </w:rPr>
-        <w:t xml:space="preserve">- UBND </w:t>
-      </w:r>
-      <w:r>
-        <w:rPr>
-          <w:rFonts w:ascii="Times New Roman" w:eastAsia="Times New Roman" w:hAnsi="Times New Roman" w:cs="Times New Roman"/>
-          <w:sz w:val="26"/>
-          <w:szCs w:val="26"/>
-        </w:rPr>
-        <w:t>{{hkd_ward}}</w:t>
-      </w:r>
-      <w:r>
-        <w:rPr>
-          <w:rFonts w:ascii="Times New Roman" w:eastAsia="Times New Roman" w:hAnsi="Times New Roman" w:cs="Times New Roman"/>
-          <w:sz w:val="26"/>
-          <w:szCs w:val="26"/>
+        <w:t>để n</w:t>
+      </w:r>
+      <w:r>
+        <w:rPr>
+          <w:rFonts w:ascii="Times New Roman" w:eastAsia="Times New Roman" w:hAnsi="Times New Roman"/>
+          <w:sz w:val="26"/>
+          <w:szCs w:val="26"/>
+        </w:rPr>
+        <w:t>hận</w:t>
+      </w:r>
+      <w:r>
+        <w:rPr>
+          <w:rFonts w:ascii="Times New Roman" w:eastAsia="Times New Roman" w:hAnsi="Times New Roman"/>
+          <w:sz w:val="26"/>
+          <w:szCs w:val="26"/>
+          <w:lang w:val="vi-VN"/>
         </w:rPr>
         <w:t xml:space="preserve"> </w:t>
       </w:r>
@@ -874,26 +849,17 @@
           <w:rFonts w:ascii="Times New Roman" w:eastAsia="Times New Roman" w:hAnsi="Times New Roman"/>
           <w:sz w:val="26"/>
           <w:szCs w:val="26"/>
-          <w:lang w:val="vi-VN"/>
-        </w:rPr>
-        <w:t>để n</w:t>
+        </w:rPr>
+        <w:t>kết quả</w:t>
       </w:r>
       <w:r>
         <w:rPr>
           <w:rFonts w:ascii="Times New Roman" w:eastAsia="Times New Roman" w:hAnsi="Times New Roman"/>
           <w:sz w:val="26"/>
           <w:szCs w:val="26"/>
-        </w:rPr>
-        <w:t>hận</w:t>
-      </w:r>
-      <w:r>
-        <w:rPr>
-          <w:rFonts w:ascii="Times New Roman" w:eastAsia="Times New Roman" w:hAnsi="Times New Roman"/>
-          <w:sz w:val="26"/>
-          <w:szCs w:val="26"/>
-          <w:lang w:val="vi-VN"/>
-        </w:rPr>
-        <w:t xml:space="preserve"> hồ sơ đăng ký thành lập </w:t>
+          <w:lang w:val="vi-VN"/>
+        </w:rPr>
+        <w:t xml:space="preserve"> đăng ký thành lập </w:t>
       </w:r>
       <w:r>
         <w:rPr>
@@ -967,40 +933,15 @@
           <w:szCs w:val="26"/>
           <w:lang w:val="vi-VN"/>
         </w:rPr>
-        <w:t>tại Phòng Kinh tế</w:t>
-      </w:r>
-      <w:r>
-        <w:rPr>
-          <w:rFonts w:ascii="Times New Roman" w:eastAsia="Times New Roman" w:hAnsi="Times New Roman" w:cs="Times New Roman"/>
-          <w:sz w:val="26"/>
-          <w:szCs w:val="26"/>
-        </w:rPr>
-        <w:t>{{</w:t>
-      </w:r>
-      <w:r>
-        <w:rPr>
-          <w:rFonts w:ascii="Times New Roman" w:eastAsia="Times New Roman" w:hAnsi="Times New Roman" w:cs="Times New Roman"/>
-          <w:sz w:val="26"/>
-          <w:szCs w:val="26"/>
-        </w:rPr>
-        <w:t>suffix</w:t>
-      </w:r>
-      <w:r>
-        <w:rPr>
-          <w:rFonts w:ascii="Times New Roman" w:eastAsia="Times New Roman" w:hAnsi="Times New Roman" w:cs="Times New Roman"/>
-          <w:sz w:val="26"/>
-          <w:szCs w:val="26"/>
-        </w:rPr>
-        <w:t xml:space="preserve">}} </w:t>
+        <w:t xml:space="preserve">tại </w:t>
       </w:r>
       <w:r>
         <w:rPr>
           <w:rFonts w:ascii="Times New Roman" w:eastAsia="Times New Roman" w:hAnsi="Times New Roman"/>
           <w:sz w:val="26"/>
           <w:szCs w:val="26"/>
-          <w:lang w:val="vi-VN"/>
-        </w:rPr>
-        <w:t>- UBND</w:t>
+        </w:rPr>
+        <w:t>Điểm phục vụ hành chính công</w:t>
       </w:r>
       <w:r>
         <w:rPr>
@@ -1031,7 +972,7 @@
     <w:p>
       <w:pPr>
         <w:spacing w:after="0" w:line="360" w:lineRule="auto"/>
-        <w:ind w:right="-471" w:firstLine="720"/>
+        <w:ind w:right="-812" w:firstLine="720"/>
         <w:jc w:val="both"/>
         <w:rPr>
           <w:rFonts w:ascii="Times New Roman" w:eastAsia="Times New Roman" w:hAnsi="Times New Roman" w:cs="Times New Roman"/>
@@ -1046,48 +987,15 @@
           <w:szCs w:val="26"/>
           <w:lang w:val="vi-VN"/>
         </w:rPr>
-        <w:t>Đề nghị Phòng Kinh tế</w:t>
-      </w:r>
-      <w:r>
-        <w:rPr>
-          <w:rFonts w:ascii="Times New Roman" w:eastAsia="Times New Roman" w:hAnsi="Times New Roman" w:cs="Times New Roman"/>
-          <w:sz w:val="26"/>
-          <w:szCs w:val="26"/>
-        </w:rPr>
-        <w:t>{{</w:t>
-      </w:r>
-      <w:r>
-        <w:rPr>
-          <w:rFonts w:ascii="Times New Roman" w:eastAsia="Times New Roman" w:hAnsi="Times New Roman" w:cs="Times New Roman"/>
-          <w:sz w:val="26"/>
-          <w:szCs w:val="26"/>
-        </w:rPr>
-        <w:t>suffix</w:t>
-      </w:r>
-      <w:r>
-        <w:rPr>
-          <w:rFonts w:ascii="Times New Roman" w:eastAsia="Times New Roman" w:hAnsi="Times New Roman" w:cs="Times New Roman"/>
-          <w:sz w:val="26"/>
-          <w:szCs w:val="26"/>
-        </w:rPr>
-        <w:t xml:space="preserve">}} </w:t>
-      </w:r>
-      <w:r>
-        <w:rPr>
-          <w:rFonts w:ascii="Times New Roman" w:eastAsia="Times New Roman" w:hAnsi="Times New Roman" w:cs="Times New Roman"/>
-          <w:sz w:val="26"/>
-          <w:szCs w:val="26"/>
-          <w:lang w:val="vi-VN"/>
-        </w:rPr>
-        <w:t>- UBND</w:t>
-      </w:r>
-      <w:r>
-        <w:rPr>
-          <w:rFonts w:ascii="Times New Roman" w:eastAsia="Times New Roman" w:hAnsi="Times New Roman" w:cs="Times New Roman"/>
-          <w:sz w:val="26"/>
-          <w:szCs w:val="26"/>
-        </w:rPr>
-        <w:t xml:space="preserve"> </w:t>
+        <w:t xml:space="preserve">Đề nghị </w:t>
+      </w:r>
+      <w:r>
+        <w:rPr>
+          <w:rFonts w:ascii="Times New Roman" w:eastAsia="Times New Roman" w:hAnsi="Times New Roman" w:cs="Times New Roman"/>
+          <w:sz w:val="26"/>
+          <w:szCs w:val="26"/>
+        </w:rPr>
+        <w:t>Điểm phục vụ hành chính công</w:t>
       </w:r>
       <w:r>
         <w:rPr>
@@ -1909,24 +1817,23 @@
           <w:szCs w:val="26"/>
           <w:lang w:val="vi-VN"/>
         </w:rPr>
-        <w:t>Kính gửi: Phòng Kinh tế</w:t>
-      </w:r>
-      <w:r>
-        <w:rPr>
-          <w:rFonts w:ascii="Times New Roman" w:eastAsia="Times New Roman" w:hAnsi="Times New Roman" w:cs="Times New Roman"/>
-          <w:sz w:val="26"/>
-          <w:szCs w:val="26"/>
-        </w:rPr>
-        <w:t>{{suffix}}</w:t>
-      </w:r>
-      <w:r>
-        <w:rPr>
-          <w:rFonts w:ascii="Times New Roman" w:eastAsia="Times New Roman" w:hAnsi="Times New Roman" w:cs="Times New Roman"/>
-          <w:sz w:val="26"/>
-          <w:szCs w:val="26"/>
-          <w:lang w:val="vi-VN"/>
-        </w:rPr>
-        <w:t xml:space="preserve"> - UBND </w:t>
+        <w:t xml:space="preserve">Kính gửi: </w:t>
+      </w:r>
+      <w:r>
+        <w:rPr>
+          <w:rFonts w:ascii="Times New Roman" w:eastAsia="Times New Roman" w:hAnsi="Times New Roman" w:cs="Times New Roman"/>
+          <w:sz w:val="26"/>
+          <w:szCs w:val="26"/>
+        </w:rPr>
+        <w:t>Điểm phục vụ hành chính công</w:t>
+      </w:r>
+      <w:r>
+        <w:rPr>
+          <w:rFonts w:ascii="Times New Roman" w:eastAsia="Times New Roman" w:hAnsi="Times New Roman" w:cs="Times New Roman"/>
+          <w:sz w:val="26"/>
+          <w:szCs w:val="26"/>
+        </w:rPr>
+        <w:t xml:space="preserve"> </w:t>
       </w:r>
       <w:r>
         <w:rPr>
@@ -2106,7 +2013,7 @@
     <w:p>
       <w:pPr>
         <w:spacing w:after="0" w:line="360" w:lineRule="auto"/>
-        <w:ind w:right="-471" w:firstLine="567"/>
+        <w:ind w:right="-722" w:firstLine="567"/>
         <w:jc w:val="both"/>
         <w:rPr>
           <w:rFonts w:ascii="Times New Roman" w:hAnsi="Times New Roman" w:cs="Times New Roman"/>
@@ -2259,35 +2166,17 @@
           <w:rFonts w:ascii="Times New Roman" w:eastAsia="Times New Roman" w:hAnsi="Times New Roman"/>
           <w:sz w:val="26"/>
           <w:szCs w:val="26"/>
-          <w:lang w:val="vi-VN"/>
-        </w:rPr>
-        <w:t>Phòng Kinh tế</w:t>
-      </w:r>
-      <w:r>
-        <w:rPr>
-          <w:rFonts w:ascii="Times New Roman" w:eastAsia="Times New Roman" w:hAnsi="Times New Roman" w:cs="Times New Roman"/>
-          <w:sz w:val="26"/>
-          <w:szCs w:val="26"/>
-        </w:rPr>
-        <w:t>{{suffix}}</w:t>
-      </w:r>
-      <w:r>
-        <w:rPr>
-          <w:rFonts w:ascii="Times New Roman" w:eastAsia="Times New Roman" w:hAnsi="Times New Roman" w:cs="Times New Roman"/>
+        </w:rPr>
+        <w:t>Điểm phục vụ hành chính công</w:t>
+      </w:r>
+      <w:r>
+        <w:rPr>
+          <w:rFonts w:ascii="Times New Roman" w:eastAsia="Times New Roman" w:hAnsi="Times New Roman"/>
           <w:sz w:val="26"/>
           <w:szCs w:val="26"/>
           <w:lang w:val="vi-VN"/>
         </w:rPr>
         <w:t xml:space="preserve"> </w:t>
-      </w:r>
-      <w:r>
-        <w:rPr>
-          <w:rFonts w:ascii="Times New Roman" w:eastAsia="Times New Roman" w:hAnsi="Times New Roman"/>
-          <w:sz w:val="26"/>
-          <w:szCs w:val="26"/>
-          <w:lang w:val="vi-VN"/>
-        </w:rPr>
-        <w:t xml:space="preserve">- UBND </w:t>
       </w:r>
       <w:r>
         <w:rPr>
@@ -2369,24 +2258,15 @@
           <w:sz w:val="26"/>
           <w:szCs w:val="26"/>
         </w:rPr>
-        <w:t xml:space="preserve">}} </w:t>
+        <w:t>}}</w:t>
       </w:r>
       <w:r>
         <w:rPr>
           <w:rFonts w:ascii="Times New Roman" w:eastAsia="Times New Roman" w:hAnsi="Times New Roman"/>
           <w:sz w:val="26"/>
           <w:szCs w:val="26"/>
-          <w:lang w:val="vi-VN"/>
-        </w:rPr>
-        <w:t>tại Phòng Kinh tế</w:t>
-      </w:r>
-      <w:r>
-        <w:rPr>
-          <w:rFonts w:ascii="Times New Roman" w:eastAsia="Times New Roman" w:hAnsi="Times New Roman" w:cs="Times New Roman"/>
-          <w:sz w:val="26"/>
-          <w:szCs w:val="26"/>
-        </w:rPr>
-        <w:t xml:space="preserve">{{suffix}} </w:t>
+        </w:rPr>
+        <w:t xml:space="preserve"> </w:t>
       </w:r>
       <w:r>
         <w:rPr>
@@ -2395,7 +2275,7 @@
           <w:szCs w:val="26"/>
           <w:lang w:val="vi-VN"/>
         </w:rPr>
-        <w:t>- UBND</w:t>
+        <w:t xml:space="preserve">tại </w:t>
       </w:r>
       <w:r>
         <w:rPr>
@@ -2403,7 +2283,15 @@
           <w:sz w:val="26"/>
           <w:szCs w:val="26"/>
         </w:rPr>
-        <w:t xml:space="preserve"> </w:t>
+        <w:t>Điểm phục vụ hành chính côn</w:t>
+      </w:r>
+      <w:r>
+        <w:rPr>
+          <w:rFonts w:ascii="Times New Roman" w:eastAsia="Times New Roman" w:hAnsi="Times New Roman"/>
+          <w:sz w:val="26"/>
+          <w:szCs w:val="26"/>
+        </w:rPr>
+        <w:t xml:space="preserve">g </w:t>
       </w:r>
       <w:r>
         <w:rPr>
@@ -2426,7 +2314,7 @@
     <w:p>
       <w:pPr>
         <w:spacing w:after="0" w:line="360" w:lineRule="auto"/>
-        <w:ind w:right="-471" w:firstLine="720"/>
+        <w:ind w:right="-812" w:firstLine="720"/>
         <w:jc w:val="both"/>
         <w:rPr>
           <w:rFonts w:ascii="Times New Roman" w:eastAsia="Times New Roman" w:hAnsi="Times New Roman" w:cs="Times New Roman"/>
@@ -2441,32 +2329,31 @@
           <w:szCs w:val="26"/>
           <w:lang w:val="vi-VN"/>
         </w:rPr>
-        <w:t>Đề nghị Phòng Kinh tế</w:t>
-      </w:r>
-      <w:r>
-        <w:rPr>
-          <w:rFonts w:ascii="Times New Roman" w:eastAsia="Times New Roman" w:hAnsi="Times New Roman" w:cs="Times New Roman"/>
-          <w:sz w:val="26"/>
-          <w:szCs w:val="26"/>
-        </w:rPr>
-        <w:t xml:space="preserve">{{suffix}} </w:t>
-      </w:r>
-      <w:r>
-        <w:rPr>
-          <w:rFonts w:ascii="Times New Roman" w:eastAsia="Times New Roman" w:hAnsi="Times New Roman" w:cs="Times New Roman"/>
-          <w:sz w:val="26"/>
-          <w:szCs w:val="26"/>
-          <w:lang w:val="vi-VN"/>
-        </w:rPr>
-        <w:t>- UBND</w:t>
-      </w:r>
-      <w:r>
-        <w:rPr>
-          <w:rFonts w:ascii="Times New Roman" w:eastAsia="Times New Roman" w:hAnsi="Times New Roman" w:cs="Times New Roman"/>
-          <w:sz w:val="26"/>
-          <w:szCs w:val="26"/>
-        </w:rPr>
-        <w:t xml:space="preserve"> {{hkd_ward}} </w:t>
+        <w:t xml:space="preserve">Đề nghị </w:t>
+      </w:r>
+      <w:r>
+        <w:rPr>
+          <w:rFonts w:ascii="Times New Roman" w:eastAsia="Times New Roman" w:hAnsi="Times New Roman" w:cs="Times New Roman"/>
+          <w:sz w:val="26"/>
+          <w:szCs w:val="26"/>
+        </w:rPr>
+        <w:t>Điểm phục vụ hành chính công</w:t>
+      </w:r>
+      <w:r>
+        <w:rPr>
+          <w:rFonts w:ascii="Times New Roman" w:eastAsia="Times New Roman" w:hAnsi="Times New Roman" w:cs="Times New Roman"/>
+          <w:sz w:val="26"/>
+          <w:szCs w:val="26"/>
+        </w:rPr>
+        <w:t xml:space="preserve"> </w:t>
+      </w:r>
+      <w:r>
+        <w:rPr>
+          <w:rFonts w:ascii="Times New Roman" w:eastAsia="Times New Roman" w:hAnsi="Times New Roman" w:cs="Times New Roman"/>
+          <w:sz w:val="26"/>
+          <w:szCs w:val="26"/>
+        </w:rPr>
+        <w:t xml:space="preserve">{{hkd_ward}} </w:t>
       </w:r>
       <w:r>
         <w:rPr>
@@ -3305,7 +3192,6 @@
   <w:style w:type="character" w:default="1" w:styleId="DefaultParagraphFont">
     <w:name w:val="Default Paragraph Font"/>
     <w:uiPriority w:val="1"/>
-    <w:semiHidden/>
     <w:unhideWhenUsed/>
   </w:style>
   <w:style w:type="table" w:default="1" w:styleId="TableNormal">

</xml_diff>

<commit_message>
fix ui, update gov company
</commit_message>
<xml_diff>
--- a/app/templates/hkd/001_GIAY GIOI THIEU.docx
+++ b/app/templates/hkd/001_GIAY GIOI THIEU.docx
@@ -1034,6 +1034,14 @@
           <w:sz w:val="26"/>
           <w:szCs w:val="26"/>
         </w:rPr>
+        <w:t xml:space="preserve"> </w:t>
+      </w:r>
+      <w:r>
+        <w:rPr>
+          <w:rFonts w:ascii="Times New Roman" w:eastAsia="Times New Roman" w:hAnsi="Times New Roman" w:cs="Times New Roman"/>
+          <w:sz w:val="26"/>
+          <w:szCs w:val="26"/>
+        </w:rPr>
         <w:t>{{hkd_ward}}</w:t>
       </w:r>
       <w:r>
@@ -2374,7 +2382,15 @@
           <w:sz w:val="26"/>
           <w:szCs w:val="26"/>
         </w:rPr>
-        <w:t xml:space="preserve">g </w:t>
+        <w:t>g</w:t>
+      </w:r>
+      <w:r>
+        <w:rPr>
+          <w:rFonts w:ascii="Times New Roman" w:eastAsia="Times New Roman" w:hAnsi="Times New Roman"/>
+          <w:sz w:val="26"/>
+          <w:szCs w:val="26"/>
+        </w:rPr>
+        <w:t xml:space="preserve"> </w:t>
       </w:r>
       <w:r>
         <w:rPr>
@@ -3275,6 +3291,7 @@
   <w:style w:type="character" w:default="1" w:styleId="DefaultParagraphFont">
     <w:name w:val="Default Paragraph Font"/>
     <w:uiPriority w:val="1"/>
+    <w:semiHidden/>
     <w:unhideWhenUsed/>
   </w:style>
   <w:style w:type="table" w:default="1" w:styleId="TableNormal">

</xml_diff>

<commit_message>
update: hop dong; verify fill; fix hop dong
</commit_message>
<xml_diff>
--- a/app/templates/hkd/001_GIAY GIOI THIEU.docx
+++ b/app/templates/hkd/001_GIAY GIOI THIEU.docx
@@ -450,7 +450,7 @@
           <w:sz w:val="26"/>
           <w:szCs w:val="26"/>
         </w:rPr>
-        <w:t>Điểm phục vụ hành chính công</w:t>
+        <w:t>Điểm hỗ trợ dịch vụ công số</w:t>
       </w:r>
       <w:r>
         <w:rPr>
@@ -823,7 +823,7 @@
           <w:sz w:val="26"/>
           <w:szCs w:val="26"/>
         </w:rPr>
-        <w:t>Điểm phục vụ hành chính công</w:t>
+        <w:t>Điểm hỗ trợ dịch vụ công số</w:t>
       </w:r>
       <w:r>
         <w:rPr>
@@ -972,7 +972,7 @@
           <w:sz w:val="26"/>
           <w:szCs w:val="26"/>
         </w:rPr>
-        <w:t>Điểm phục vụ hành chính công</w:t>
+        <w:t>Điểm hỗ trợ dịch vụ công số</w:t>
       </w:r>
       <w:r>
         <w:rPr>
@@ -1026,7 +1026,7 @@
           <w:sz w:val="26"/>
           <w:szCs w:val="26"/>
         </w:rPr>
-        <w:t>Điểm phục vụ hành chính công</w:t>
+        <w:t>Điểm hỗ trợ dịch vụ công số</w:t>
       </w:r>
       <w:r>
         <w:rPr>
@@ -1916,7 +1916,7 @@
           <w:sz w:val="26"/>
           <w:szCs w:val="26"/>
         </w:rPr>
-        <w:t>Điểm phục vụ hành chính công</w:t>
+        <w:t>Điểm hỗ trợ dịch vụ công số</w:t>
       </w:r>
       <w:r>
         <w:rPr>
@@ -1983,7 +1983,15 @@
           <w:sz w:val="26"/>
           <w:szCs w:val="26"/>
         </w:rPr>
-        <w:t xml:space="preserve">BÙI NGỌC LIÊN CHI  </w:t>
+        <w:t>NGÔ VIỆT HƯƠNG</w:t>
+      </w:r>
+      <w:r>
+        <w:rPr>
+          <w:rFonts w:ascii="Times New Roman" w:eastAsia="Times New Roman" w:hAnsi="Times New Roman" w:cs="Times New Roman"/>
+          <w:sz w:val="26"/>
+          <w:szCs w:val="26"/>
+        </w:rPr>
+        <w:t xml:space="preserve">  </w:t>
       </w:r>
     </w:p>
     <w:p>
@@ -2014,7 +2022,31 @@
           <w:szCs w:val="26"/>
           <w:lang w:val="en-US"/>
         </w:rPr>
-        <w:t>07/03/1999</w:t>
+        <w:t>07/0</w:t>
+      </w:r>
+      <w:r>
+        <w:rPr>
+          <w:sz w:val="26"/>
+          <w:szCs w:val="26"/>
+          <w:lang w:val="en-US"/>
+        </w:rPr>
+        <w:t>2</w:t>
+      </w:r>
+      <w:r>
+        <w:rPr>
+          <w:sz w:val="26"/>
+          <w:szCs w:val="26"/>
+          <w:lang w:val="en-US"/>
+        </w:rPr>
+        <w:t>/199</w:t>
+      </w:r>
+      <w:r>
+        <w:rPr>
+          <w:sz w:val="26"/>
+          <w:szCs w:val="26"/>
+          <w:lang w:val="en-US"/>
+        </w:rPr>
+        <w:t>6</w:t>
       </w:r>
     </w:p>
     <w:p>
@@ -2045,9 +2077,8 @@
           <w:rFonts w:ascii="Times New Roman" w:hAnsi="Times New Roman" w:cs="Times New Roman"/>
           <w:sz w:val="26"/>
           <w:szCs w:val="26"/>
-          <w:lang w:val="vi-VN"/>
-        </w:rPr>
-        <w:t>036199008566</w:t>
+        </w:rPr>
+        <w:t>035196000164</w:t>
       </w:r>
       <w:r>
         <w:rPr>
@@ -2098,7 +2129,24 @@
           <w:szCs w:val="26"/>
           <w:lang w:val="vi-VN"/>
         </w:rPr>
-        <w:t xml:space="preserve">Chức vụ: Nhân Viên </w:t>
+        <w:t xml:space="preserve">Chức vụ: </w:t>
+      </w:r>
+      <w:r>
+        <w:rPr>
+          <w:rFonts w:ascii="Times New Roman" w:eastAsia="Times New Roman" w:hAnsi="Times New Roman" w:cs="Times New Roman"/>
+          <w:sz w:val="26"/>
+          <w:szCs w:val="26"/>
+        </w:rPr>
+        <w:t>Giám đốc Nghiệp vụ</w:t>
+      </w:r>
+      <w:r>
+        <w:rPr>
+          <w:rFonts w:ascii="Times New Roman" w:eastAsia="Times New Roman" w:hAnsi="Times New Roman" w:cs="Times New Roman"/>
+          <w:sz w:val="26"/>
+          <w:szCs w:val="26"/>
+          <w:lang w:val="vi-VN"/>
+        </w:rPr>
+        <w:t xml:space="preserve"> </w:t>
       </w:r>
     </w:p>
     <w:p>
@@ -2137,33 +2185,7 @@
           <w:sz w:val="26"/>
           <w:szCs w:val="26"/>
         </w:rPr>
-        <w:t xml:space="preserve">Số 8, Ngách 25, Ngõ 506 Kim Giang, Phường </w:t>
-      </w:r>
-      <w:r>
-        <w:rPr>
-          <w:rFonts w:ascii="Times New Roman" w:hAnsi="Times New Roman" w:cs="Times New Roman"/>
-          <w:sz w:val="26"/>
-          <w:szCs w:val="26"/>
-          <w:lang w:val="vi-VN"/>
-        </w:rPr>
-        <w:t>Thanh Liệt</w:t>
-      </w:r>
-      <w:r>
-        <w:rPr>
-          <w:rFonts w:ascii="Times New Roman" w:hAnsi="Times New Roman" w:cs="Times New Roman"/>
-          <w:sz w:val="26"/>
-          <w:szCs w:val="26"/>
-        </w:rPr>
-        <w:t>, Hà Nội, Việt Nam</w:t>
-      </w:r>
-      <w:r>
-        <w:rPr>
-          <w:rFonts w:ascii="Times New Roman" w:hAnsi="Times New Roman" w:cs="Times New Roman"/>
-          <w:sz w:val="26"/>
-          <w:szCs w:val="26"/>
-          <w:lang w:val="vi-VN"/>
-        </w:rPr>
-        <w:t xml:space="preserve">  </w:t>
+        <w:t>Tầng 3, M11-01 An Khang, Khu đô thị Dương Nội, Phường Dương Nội, Hà Nội, Việt Nam</w:t>
       </w:r>
     </w:p>
     <w:p>
@@ -2190,18 +2212,27 @@
       <w:r>
         <w:rPr>
           <w:rFonts w:ascii="Times New Roman" w:hAnsi="Times New Roman" w:cs="Times New Roman"/>
-          <w:sz w:val="26"/>
-          <w:szCs w:val="26"/>
-        </w:rPr>
-        <w:t xml:space="preserve">cvpl.me.cenvi@gmail.com                               </w:t>
-      </w:r>
-      <w:r>
-        <w:rPr>
-          <w:rFonts w:ascii="Times New Roman" w:hAnsi="Times New Roman" w:cs="Times New Roman"/>
           <w:color w:val="000000"/>
           <w:sz w:val="26"/>
           <w:szCs w:val="26"/>
         </w:rPr>
+        <w:t>gdnvpl.cenvi@gmail.com</w:t>
+      </w:r>
+      <w:r>
+        <w:rPr>
+          <w:rFonts w:ascii="Times New Roman" w:hAnsi="Times New Roman" w:cs="Times New Roman"/>
+          <w:sz w:val="26"/>
+          <w:szCs w:val="26"/>
+        </w:rPr>
+        <w:t xml:space="preserve">                               </w:t>
+      </w:r>
+      <w:r>
+        <w:rPr>
+          <w:rFonts w:ascii="Times New Roman" w:hAnsi="Times New Roman" w:cs="Times New Roman"/>
+          <w:color w:val="000000"/>
+          <w:sz w:val="26"/>
+          <w:szCs w:val="26"/>
+        </w:rPr>
         <w:t>Số điện thoại:</w:t>
       </w:r>
       <w:r>
@@ -2211,24 +2242,16 @@
           <w:szCs w:val="26"/>
           <w:lang w:val="vi-VN"/>
         </w:rPr>
-        <w:t xml:space="preserve"> 0945207214</w:t>
-      </w:r>
-      <w:r>
-        <w:rPr>
-          <w:rFonts w:ascii="Times New Roman" w:hAnsi="Times New Roman" w:cs="Times New Roman"/>
-          <w:sz w:val="26"/>
-          <w:szCs w:val="26"/>
-        </w:rPr>
         <w:t xml:space="preserve"> </w:t>
       </w:r>
       <w:r>
         <w:rPr>
-          <w:rFonts w:ascii="Times New Roman" w:eastAsia="Times New Roman" w:hAnsi="Times New Roman" w:cs="Times New Roman"/>
-          <w:sz w:val="26"/>
-          <w:szCs w:val="26"/>
-          <w:lang w:val="vi-VN"/>
-        </w:rPr>
-        <w:t xml:space="preserve"> </w:t>
+          <w:rFonts w:ascii="Times New Roman" w:hAnsi="Times New Roman" w:cs="Times New Roman"/>
+          <w:sz w:val="26"/>
+          <w:szCs w:val="26"/>
+          <w:lang w:val="vi-VN"/>
+        </w:rPr>
+        <w:t>0967538685</w:t>
       </w:r>
     </w:p>
     <w:p>
@@ -2258,7 +2281,7 @@
           <w:sz w:val="26"/>
           <w:szCs w:val="26"/>
         </w:rPr>
-        <w:t>Điểm phục vụ hành chính công</w:t>
+        <w:t>Điểm hỗ trợ dịch vụ công số</w:t>
       </w:r>
       <w:r>
         <w:rPr>
@@ -2374,15 +2397,7 @@
           <w:sz w:val="26"/>
           <w:szCs w:val="26"/>
         </w:rPr>
-        <w:t>Điểm phục vụ hành chính côn</w:t>
-      </w:r>
-      <w:r>
-        <w:rPr>
-          <w:rFonts w:ascii="Times New Roman" w:eastAsia="Times New Roman" w:hAnsi="Times New Roman"/>
-          <w:sz w:val="26"/>
-          <w:szCs w:val="26"/>
-        </w:rPr>
-        <w:t>g</w:t>
+        <w:t>Điểm hỗ trợ dịch vụ công số</w:t>
       </w:r>
       <w:r>
         <w:rPr>
@@ -2436,7 +2451,7 @@
           <w:sz w:val="26"/>
           <w:szCs w:val="26"/>
         </w:rPr>
-        <w:t>Điểm phục vụ hành chính công</w:t>
+        <w:t>Điểm hỗ trợ dịch vụ công số</w:t>
       </w:r>
       <w:r>
         <w:rPr>
@@ -2486,7 +2501,23 @@
           <w:sz w:val="26"/>
           <w:szCs w:val="26"/>
         </w:rPr>
-        <w:t xml:space="preserve"> BÙI NGỌC LIÊN CHI </w:t>
+        <w:t xml:space="preserve"> </w:t>
+      </w:r>
+      <w:r>
+        <w:rPr>
+          <w:rFonts w:ascii="Times New Roman" w:eastAsia="Times New Roman" w:hAnsi="Times New Roman" w:cs="Times New Roman"/>
+          <w:sz w:val="26"/>
+          <w:szCs w:val="26"/>
+        </w:rPr>
+        <w:t>NGÔ VIỆT HƯƠNG</w:t>
+      </w:r>
+      <w:r>
+        <w:rPr>
+          <w:rFonts w:ascii="Times New Roman" w:eastAsia="Times New Roman" w:hAnsi="Times New Roman" w:cs="Times New Roman"/>
+          <w:sz w:val="26"/>
+          <w:szCs w:val="26"/>
+        </w:rPr>
+        <w:t xml:space="preserve"> </w:t>
       </w:r>
       <w:r>
         <w:rPr>

</xml_diff>